<commit_message>
Include manuscript and make it render
</commit_message>
<xml_diff>
--- a/analysis/templates/template.docx
+++ b/analysis/templates/template.docx
@@ -14,16 +14,26 @@
       <w:pPr>
         <w:pStyle w:val="Author"/>
       </w:pPr>
+      <w:proofErr w:type="gramStart"/>
       <w:r>
-        <w:t>author 1</w:t>
+        <w:t>author</w:t>
+      </w:r>
+      <w:proofErr w:type="gramEnd"/>
+      <w:r>
+        <w:t xml:space="preserve"> 1</w:t>
       </w:r>
     </w:p>
     <w:p>
       <w:pPr>
         <w:pStyle w:val="Author"/>
       </w:pPr>
+      <w:proofErr w:type="gramStart"/>
       <w:r>
-        <w:t>other author</w:t>
+        <w:t>other</w:t>
+      </w:r>
+      <w:proofErr w:type="gramEnd"/>
+      <w:r>
+        <w:t xml:space="preserve"> author</w:t>
       </w:r>
     </w:p>
     <w:p>
@@ -84,7 +94,21 @@
       <w:bookmarkStart w:id="4" w:name="heading-5---this-is-for-the-page-break-w"/>
       <w:bookmarkEnd w:id="4"/>
     </w:p>
+    <w:p>
+      <w:pPr>
+        <w:pStyle w:val="berschrift5"/>
+      </w:pPr>
+      <w:r>
+        <w:t>Heading 5</w:t>
+      </w:r>
+    </w:p>
     <w:sectPr>
+      <w:headerReference w:type="even" r:id="rId8"/>
+      <w:headerReference w:type="default" r:id="rId9"/>
+      <w:footerReference w:type="even" r:id="rId10"/>
+      <w:footerReference w:type="default" r:id="rId11"/>
+      <w:headerReference w:type="first" r:id="rId12"/>
+      <w:footerReference w:type="first" r:id="rId13"/>
       <w:pgSz w:w="12240" w:h="15840"/>
       <w:pgMar w:top="1440" w:right="1440" w:bottom="1440" w:left="1440" w:header="720" w:footer="720" w:gutter="0"/>
       <w:lnNumType w:countBy="1" w:restart="continuous"/>
@@ -118,6 +142,36 @@
     </w:p>
   </w:endnote>
 </w:endnotes>
+</file>
+
+<file path=word/footer1.xml><?xml version="1.0" encoding="utf-8"?>
+<w:ftr xmlns:ve="http://schemas.openxmlformats.org/markup-compatibility/2006" xmlns:o="urn:schemas-microsoft-com:office:office" xmlns:r="http://schemas.openxmlformats.org/officeDocument/2006/relationships" xmlns:m="http://schemas.openxmlformats.org/officeDocument/2006/math" xmlns:v="urn:schemas-microsoft-com:vml" xmlns:wp="http://schemas.openxmlformats.org/drawingml/2006/wordprocessingDrawing" xmlns:w10="urn:schemas-microsoft-com:office:word" xmlns:w="http://schemas.openxmlformats.org/wordprocessingml/2006/main" xmlns:wne="http://schemas.microsoft.com/office/word/2006/wordml">
+  <w:p>
+    <w:pPr>
+      <w:pStyle w:val="Fuzeile"/>
+    </w:pPr>
+  </w:p>
+</w:ftr>
+</file>
+
+<file path=word/footer2.xml><?xml version="1.0" encoding="utf-8"?>
+<w:ftr xmlns:ve="http://schemas.openxmlformats.org/markup-compatibility/2006" xmlns:o="urn:schemas-microsoft-com:office:office" xmlns:r="http://schemas.openxmlformats.org/officeDocument/2006/relationships" xmlns:m="http://schemas.openxmlformats.org/officeDocument/2006/math" xmlns:v="urn:schemas-microsoft-com:vml" xmlns:wp="http://schemas.openxmlformats.org/drawingml/2006/wordprocessingDrawing" xmlns:w10="urn:schemas-microsoft-com:office:word" xmlns:w="http://schemas.openxmlformats.org/wordprocessingml/2006/main" xmlns:wne="http://schemas.microsoft.com/office/word/2006/wordml">
+  <w:p>
+    <w:pPr>
+      <w:pStyle w:val="Fuzeile"/>
+    </w:pPr>
+  </w:p>
+</w:ftr>
+</file>
+
+<file path=word/footer3.xml><?xml version="1.0" encoding="utf-8"?>
+<w:ftr xmlns:ve="http://schemas.openxmlformats.org/markup-compatibility/2006" xmlns:o="urn:schemas-microsoft-com:office:office" xmlns:r="http://schemas.openxmlformats.org/officeDocument/2006/relationships" xmlns:m="http://schemas.openxmlformats.org/officeDocument/2006/math" xmlns:v="urn:schemas-microsoft-com:vml" xmlns:wp="http://schemas.openxmlformats.org/drawingml/2006/wordprocessingDrawing" xmlns:w10="urn:schemas-microsoft-com:office:word" xmlns:w="http://schemas.openxmlformats.org/wordprocessingml/2006/main" xmlns:wne="http://schemas.microsoft.com/office/word/2006/wordml">
+  <w:p>
+    <w:pPr>
+      <w:pStyle w:val="Fuzeile"/>
+    </w:pPr>
+  </w:p>
+</w:ftr>
 </file>
 
 <file path=word/footnotes.xml><?xml version="1.0" encoding="utf-8"?>
@@ -137,6 +191,36 @@
     </w:p>
   </w:footnote>
 </w:footnotes>
+</file>
+
+<file path=word/header1.xml><?xml version="1.0" encoding="utf-8"?>
+<w:hdr xmlns:ve="http://schemas.openxmlformats.org/markup-compatibility/2006" xmlns:o="urn:schemas-microsoft-com:office:office" xmlns:r="http://schemas.openxmlformats.org/officeDocument/2006/relationships" xmlns:m="http://schemas.openxmlformats.org/officeDocument/2006/math" xmlns:v="urn:schemas-microsoft-com:vml" xmlns:wp="http://schemas.openxmlformats.org/drawingml/2006/wordprocessingDrawing" xmlns:w10="urn:schemas-microsoft-com:office:word" xmlns:w="http://schemas.openxmlformats.org/wordprocessingml/2006/main" xmlns:wne="http://schemas.microsoft.com/office/word/2006/wordml">
+  <w:p>
+    <w:pPr>
+      <w:pStyle w:val="Kopfzeile"/>
+    </w:pPr>
+  </w:p>
+</w:hdr>
+</file>
+
+<file path=word/header2.xml><?xml version="1.0" encoding="utf-8"?>
+<w:hdr xmlns:ve="http://schemas.openxmlformats.org/markup-compatibility/2006" xmlns:o="urn:schemas-microsoft-com:office:office" xmlns:r="http://schemas.openxmlformats.org/officeDocument/2006/relationships" xmlns:m="http://schemas.openxmlformats.org/officeDocument/2006/math" xmlns:v="urn:schemas-microsoft-com:vml" xmlns:wp="http://schemas.openxmlformats.org/drawingml/2006/wordprocessingDrawing" xmlns:w10="urn:schemas-microsoft-com:office:word" xmlns:w="http://schemas.openxmlformats.org/wordprocessingml/2006/main" xmlns:wne="http://schemas.microsoft.com/office/word/2006/wordml">
+  <w:p>
+    <w:pPr>
+      <w:pStyle w:val="Kopfzeile"/>
+    </w:pPr>
+  </w:p>
+</w:hdr>
+</file>
+
+<file path=word/header3.xml><?xml version="1.0" encoding="utf-8"?>
+<w:hdr xmlns:ve="http://schemas.openxmlformats.org/markup-compatibility/2006" xmlns:o="urn:schemas-microsoft-com:office:office" xmlns:r="http://schemas.openxmlformats.org/officeDocument/2006/relationships" xmlns:m="http://schemas.openxmlformats.org/officeDocument/2006/math" xmlns:v="urn:schemas-microsoft-com:vml" xmlns:wp="http://schemas.openxmlformats.org/drawingml/2006/wordprocessingDrawing" xmlns:w10="urn:schemas-microsoft-com:office:word" xmlns:w="http://schemas.openxmlformats.org/wordprocessingml/2006/main" xmlns:wne="http://schemas.microsoft.com/office/word/2006/wordml">
+  <w:p>
+    <w:pPr>
+      <w:pStyle w:val="Kopfzeile"/>
+    </w:pPr>
+  </w:p>
+</w:hdr>
 </file>
 
 <file path=word/numbering.xml><?xml version="1.0" encoding="utf-8"?>
@@ -449,6 +533,7 @@
   <w:latentStyles w:defLockedState="0" w:defUIPriority="0" w:defSemiHidden="1" w:defUnhideWhenUsed="1" w:defQFormat="0" w:count="267">
     <w:lsdException w:name="Normal" w:semiHidden="0" w:unhideWhenUsed="0"/>
     <w:lsdException w:name="heading 1" w:semiHidden="0" w:unhideWhenUsed="0"/>
+    <w:lsdException w:name="heading 4" w:uiPriority="9" w:qFormat="1"/>
     <w:lsdException w:name="table of authorities" w:semiHidden="0" w:unhideWhenUsed="0"/>
     <w:lsdException w:name="List" w:semiHidden="0" w:unhideWhenUsed="0"/>
     <w:lsdException w:name="List Bullet" w:semiHidden="0" w:unhideWhenUsed="0"/>
@@ -673,26 +758,15 @@
   </w:style>
   <w:style w:type="paragraph" w:styleId="berschrift5">
     <w:name w:val="heading 5"/>
-    <w:basedOn w:val="Standard"/>
+    <w:basedOn w:val="berschrift4"/>
     <w:next w:val="Textkrper"/>
     <w:uiPriority w:val="9"/>
     <w:unhideWhenUsed/>
     <w:qFormat/>
-    <w:rsid w:val="00884F3F"/>
-    <w:pPr>
-      <w:keepNext/>
-      <w:keepLines/>
-      <w:pageBreakBefore/>
-      <w:spacing w:before="200" w:after="0" w:line="20" w:lineRule="exact"/>
+    <w:rsid w:val="007B6B4D"/>
+    <w:pPr>
       <w:outlineLvl w:val="4"/>
     </w:pPr>
-    <w:rPr>
-      <w:rFonts w:asciiTheme="majorHAnsi" w:eastAsiaTheme="majorEastAsia" w:hAnsiTheme="majorHAnsi" w:cstheme="majorBidi"/>
-      <w:i/>
-      <w:iCs/>
-      <w:color w:val="FFFFFF" w:themeColor="background1"/>
-      <w:sz w:val="16"/>
-    </w:rPr>
   </w:style>
   <w:style w:type="paragraph" w:styleId="berschrift6">
     <w:name w:val="heading 6"/>
@@ -1344,6 +1418,50 @@
     <w:name w:val="line number"/>
     <w:basedOn w:val="Absatz-Standardschriftart"/>
     <w:rsid w:val="00014752"/>
+  </w:style>
+  <w:style w:type="paragraph" w:styleId="Kopfzeile">
+    <w:name w:val="header"/>
+    <w:basedOn w:val="Standard"/>
+    <w:link w:val="KopfzeileZchn"/>
+    <w:semiHidden/>
+    <w:unhideWhenUsed/>
+    <w:rsid w:val="007B6B4D"/>
+    <w:pPr>
+      <w:tabs>
+        <w:tab w:val="center" w:pos="4513"/>
+        <w:tab w:val="right" w:pos="9026"/>
+      </w:tabs>
+      <w:spacing w:after="0"/>
+    </w:pPr>
+  </w:style>
+  <w:style w:type="character" w:customStyle="1" w:styleId="KopfzeileZchn">
+    <w:name w:val="Kopfzeile Zchn"/>
+    <w:basedOn w:val="Absatz-Standardschriftart"/>
+    <w:link w:val="Kopfzeile"/>
+    <w:semiHidden/>
+    <w:rsid w:val="007B6B4D"/>
+  </w:style>
+  <w:style w:type="paragraph" w:styleId="Fuzeile">
+    <w:name w:val="footer"/>
+    <w:basedOn w:val="Standard"/>
+    <w:link w:val="FuzeileZchn"/>
+    <w:semiHidden/>
+    <w:unhideWhenUsed/>
+    <w:rsid w:val="007B6B4D"/>
+    <w:pPr>
+      <w:tabs>
+        <w:tab w:val="center" w:pos="4513"/>
+        <w:tab w:val="right" w:pos="9026"/>
+      </w:tabs>
+      <w:spacing w:after="0"/>
+    </w:pPr>
+  </w:style>
+  <w:style w:type="character" w:customStyle="1" w:styleId="FuzeileZchn">
+    <w:name w:val="Fußzeile Zchn"/>
+    <w:basedOn w:val="Absatz-Standardschriftart"/>
+    <w:link w:val="Fuzeile"/>
+    <w:semiHidden/>
+    <w:rsid w:val="007B6B4D"/>
   </w:style>
 </w:styles>
 </file>
@@ -1671,7 +1789,7 @@
 </file>
 
 <file path=customXml/itemProps1.xml><?xml version="1.0" encoding="utf-8"?>
-<ds:datastoreItem xmlns:ds="http://schemas.openxmlformats.org/officeDocument/2006/customXml" ds:itemID="{002701E5-32AB-4B9A-A711-A9C93873BC60}">
+<ds:datastoreItem xmlns:ds="http://schemas.openxmlformats.org/officeDocument/2006/customXml" ds:itemID="{CDF09A30-3AAB-41C3-BCE5-3D0A78A19764}">
   <ds:schemaRefs>
     <ds:schemaRef ds:uri="http://schemas.openxmlformats.org/officeDocument/2006/bibliography"/>
   </ds:schemaRefs>

</xml_diff>

<commit_message>
include histogram for average score per article and editorial changes
</commit_message>
<xml_diff>
--- a/analysis/templates/template.docx
+++ b/analysis/templates/template.docx
@@ -14,26 +14,16 @@
       <w:pPr>
         <w:pStyle w:val="Author"/>
       </w:pPr>
-      <w:proofErr w:type="gramStart"/>
       <w:r>
-        <w:t>author</w:t>
-      </w:r>
-      <w:proofErr w:type="gramEnd"/>
-      <w:r>
-        <w:t xml:space="preserve"> 1</w:t>
+        <w:t>author 1</w:t>
       </w:r>
     </w:p>
     <w:p>
       <w:pPr>
         <w:pStyle w:val="Author"/>
       </w:pPr>
-      <w:proofErr w:type="gramStart"/>
       <w:r>
-        <w:t>other</w:t>
-      </w:r>
-      <w:proofErr w:type="gramEnd"/>
-      <w:r>
-        <w:t xml:space="preserve"> author</w:t>
+        <w:t>other author</w:t>
       </w:r>
     </w:p>
     <w:p>
@@ -156,11 +146,31 @@
 
 <file path=word/footer2.xml><?xml version="1.0" encoding="utf-8"?>
 <w:ftr xmlns:ve="http://schemas.openxmlformats.org/markup-compatibility/2006" xmlns:o="urn:schemas-microsoft-com:office:office" xmlns:r="http://schemas.openxmlformats.org/officeDocument/2006/relationships" xmlns:m="http://schemas.openxmlformats.org/officeDocument/2006/math" xmlns:v="urn:schemas-microsoft-com:vml" xmlns:wp="http://schemas.openxmlformats.org/drawingml/2006/wordprocessingDrawing" xmlns:w10="urn:schemas-microsoft-com:office:word" xmlns:w="http://schemas.openxmlformats.org/wordprocessingml/2006/main" xmlns:wne="http://schemas.microsoft.com/office/word/2006/wordml">
-  <w:p>
-    <w:pPr>
-      <w:pStyle w:val="Fuzeile"/>
-    </w:pPr>
-  </w:p>
+  <w:sdt>
+    <w:sdtPr>
+      <w:id w:val="108398313"/>
+      <w:docPartObj>
+        <w:docPartGallery w:val="Page Numbers (Bottom of Page)"/>
+        <w:docPartUnique/>
+      </w:docPartObj>
+    </w:sdtPr>
+    <w:sdtContent>
+      <w:p>
+        <w:pPr>
+          <w:pStyle w:val="Fuzeile"/>
+          <w:jc w:val="right"/>
+        </w:pPr>
+        <w:fldSimple w:instr=" PAGE   \* MERGEFORMAT ">
+          <w:r>
+            <w:rPr>
+              <w:noProof/>
+            </w:rPr>
+            <w:t>1</w:t>
+          </w:r>
+        </w:fldSimple>
+      </w:p>
+    </w:sdtContent>
+  </w:sdt>
 </w:ftr>
 </file>
 
@@ -534,6 +544,7 @@
     <w:lsdException w:name="Normal" w:semiHidden="0" w:unhideWhenUsed="0"/>
     <w:lsdException w:name="heading 1" w:semiHidden="0" w:unhideWhenUsed="0"/>
     <w:lsdException w:name="heading 4" w:uiPriority="9" w:qFormat="1"/>
+    <w:lsdException w:name="footer" w:uiPriority="99"/>
     <w:lsdException w:name="table of authorities" w:semiHidden="0" w:unhideWhenUsed="0"/>
     <w:lsdException w:name="List" w:semiHidden="0" w:unhideWhenUsed="0"/>
     <w:lsdException w:name="List Bullet" w:semiHidden="0" w:unhideWhenUsed="0"/>
@@ -665,7 +676,10 @@
   <w:style w:type="paragraph" w:default="1" w:styleId="Standard">
     <w:name w:val="Normal"/>
     <w:qFormat/>
-    <w:rsid w:val="00323135"/>
+    <w:rsid w:val="00506E88"/>
+    <w:rPr>
+      <w:rFonts w:ascii="Times New Roman" w:hAnsi="Times New Roman"/>
+    </w:rPr>
   </w:style>
   <w:style w:type="paragraph" w:styleId="berschrift1">
     <w:name w:val="heading 1"/>
@@ -1445,7 +1459,7 @@
     <w:name w:val="footer"/>
     <w:basedOn w:val="Standard"/>
     <w:link w:val="FuzeileZchn"/>
-    <w:semiHidden/>
+    <w:uiPriority w:val="99"/>
     <w:unhideWhenUsed/>
     <w:rsid w:val="007B6B4D"/>
     <w:pPr>
@@ -1460,7 +1474,7 @@
     <w:name w:val="Fußzeile Zchn"/>
     <w:basedOn w:val="Absatz-Standardschriftart"/>
     <w:link w:val="Fuzeile"/>
-    <w:semiHidden/>
+    <w:uiPriority w:val="99"/>
     <w:rsid w:val="007B6B4D"/>
   </w:style>
 </w:styles>
@@ -1789,7 +1803,7 @@
 </file>
 
 <file path=customXml/itemProps1.xml><?xml version="1.0" encoding="utf-8"?>
-<ds:datastoreItem xmlns:ds="http://schemas.openxmlformats.org/officeDocument/2006/customXml" ds:itemID="{CDF09A30-3AAB-41C3-BCE5-3D0A78A19764}">
+<ds:datastoreItem xmlns:ds="http://schemas.openxmlformats.org/officeDocument/2006/customXml" ds:itemID="{F17C79D8-B64A-41F9-97E3-B6B6D4C46917}">
   <ds:schemaRefs>
     <ds:schemaRef ds:uri="http://schemas.openxmlformats.org/officeDocument/2006/bibliography"/>
   </ds:schemaRefs>

</xml_diff>